<commit_message>
Update CV to enhance Azure expertise and detail key achievements at ColX Group
</commit_message>
<xml_diff>
--- a/Jay Freeman CV.docx
+++ b/Jay Freeman CV.docx
@@ -161,7 +161,7 @@
       </w:r>
       <w:proofErr w:type="spellEnd"/>
       <w:r>
-        <w:t>, Azure Entra ID, Network Security Group (NSG), Point-to-Site/Site-to-Site VPN, App Service Environment (ASE), Event Hubs, Function Apps, Logic apps, Azure Firewall, DNS Forwarding Rulesets, Azure Bastion Host, VPN Gateway, Service Fabric, APIM, Azure Policies, Express Route, Key Vault, Service Bus, Stream Analytics, Log Analytics.</w:t>
+        <w:t>, Azure Entra ID, Network Security Group (NSG), Point-to-Site/Site-to-Site VPN, App Service Environment (ASE), Event Hubs, Function Apps, Logic apps, Azure Firewall, DNS Forwarding Rulesets, Azure Bastion Host, VPN Gateway, Service Fabric, APIM, Azure Policies, Express Route, Key Vault, Service Bus, Stream Analytics, Log Analytics, DNS Private Resolver, Managed DevOps Pools (MDOP), Container Apps (ACA), Container Registry (ACR).</w:t>
       </w:r>
     </w:p>
     <w:p>
@@ -195,7 +195,7 @@
         <w:t xml:space="preserve"> &amp; Compliance: </w:t>
       </w:r>
       <w:r>
-        <w:t>Azure Sentinel, Defender for Cloud, RBAC, ISO 27001, Terraform, Bicep, ARM Templates, PowerShell, Azure DevOps (YAML pipelines), Octopus Deploy, Team City, GIT.</w:t>
+        <w:t>Azure Sentinel, Defender for Cloud, RBAC, ISO 27001, Terraform, Bicep, ARM Templates, PowerShell, Azure DevOps (YAML pipelines), Octopus Deploy, Team City, GIT, Privileged Identity Management (PIM).</w:t>
       </w:r>
     </w:p>
     <w:p>
@@ -633,7 +633,7 @@
         </w:numPr>
       </w:pPr>
       <w:r>
-        <w:t>Cloud migration from on prem to Azure.</w:t>
+        <w:t>Architected and delivered a greenfield Azure Landing Zone for ColX Group from first principles, using Microsoft's Azure Verified Modules (AVM) pattern across four platform subscriptions and five Terraform stacks, merging over 90 pull requests across three repositories.</w:t>
       </w:r>
     </w:p>
     <w:p>
@@ -644,10 +644,40 @@
         </w:numPr>
       </w:pPr>
       <w:r>
-        <w:t xml:space="preserve">Setting up landing zones using Azure Verified Modules </w:t>
-      </w:r>
-      <w:r>
-        <w:t>.</w:t>
+        <w:t>Built and published a shared library of 14 reusable Terraform modules, including hub networking, DNS Private Resolver, Key Vault, VPN Gateway and Managed DevOps Pools, plus a standalone Azure DevOps pipeline-templates repository, enabling teams to self-serve infrastructure consistently.</w:t>
+      </w:r>
+    </w:p>
+    <w:p>
+      <w:pPr>
+        <w:numPr>
+          <w:ilvl w:val="0"/>
+          <w:numId w:val="36"/>
+        </w:numPr>
+      </w:pPr>
+      <w:r>
+        <w:t>Designed and delivered end-to-end Azure Privileged Identity Management (PIM) governance, covering role tiers, eligibility, approval-gated activation and audit validation, backed by an operational runbook, to establish least-privilege access across the platform.</w:t>
+      </w:r>
+    </w:p>
+    <w:p>
+      <w:pPr>
+        <w:numPr>
+          <w:ilvl w:val="0"/>
+          <w:numId w:val="36"/>
+        </w:numPr>
+      </w:pPr>
+      <w:r>
+        <w:t>Delivered secure hub-and-spoke connectivity with Azure DNS Private Resolver and a site-to-site VPN Gateway to on-premises, and selected Azure Container Apps over AKS as the platform's application hosting model.</w:t>
+      </w:r>
+    </w:p>
+    <w:p>
+      <w:pPr>
+        <w:numPr>
+          <w:ilvl w:val="0"/>
+          <w:numId w:val="36"/>
+        </w:numPr>
+      </w:pPr>
+      <w:r>
+        <w:t>Replaced Microsoft-hosted build agents with a self-hosted Managed DevOps Pool, tuning images and working-hours standby schedules to control compute spend.</w:t>
       </w:r>
     </w:p>
     <w:p>

</xml_diff>

<commit_message>
Update CV to enhance Azure expertise and detail key achievements at ColX Group (#5)
Co-authored-by: Jay Freeman <jay.freeman@colxgroup.com>
</commit_message>
<xml_diff>
--- a/Jay Freeman CV.docx
+++ b/Jay Freeman CV.docx
@@ -161,7 +161,7 @@
       </w:r>
       <w:proofErr w:type="spellEnd"/>
       <w:r>
-        <w:t>, Azure Entra ID, Network Security Group (NSG), Point-to-Site/Site-to-Site VPN, App Service Environment (ASE), Event Hubs, Function Apps, Logic apps, Azure Firewall, DNS Forwarding Rulesets, Azure Bastion Host, VPN Gateway, Service Fabric, APIM, Azure Policies, Express Route, Key Vault, Service Bus, Stream Analytics, Log Analytics.</w:t>
+        <w:t>, Azure Entra ID, Network Security Group (NSG), Point-to-Site/Site-to-Site VPN, App Service Environment (ASE), Event Hubs, Function Apps, Logic apps, Azure Firewall, DNS Forwarding Rulesets, Azure Bastion Host, VPN Gateway, Service Fabric, APIM, Azure Policies, Express Route, Key Vault, Service Bus, Stream Analytics, Log Analytics, DNS Private Resolver, Managed DevOps Pools (MDOP), Container Apps (ACA), Container Registry (ACR).</w:t>
       </w:r>
     </w:p>
     <w:p>
@@ -195,7 +195,7 @@
         <w:t xml:space="preserve"> &amp; Compliance: </w:t>
       </w:r>
       <w:r>
-        <w:t>Azure Sentinel, Defender for Cloud, RBAC, ISO 27001, Terraform, Bicep, ARM Templates, PowerShell, Azure DevOps (YAML pipelines), Octopus Deploy, Team City, GIT.</w:t>
+        <w:t>Azure Sentinel, Defender for Cloud, RBAC, ISO 27001, Terraform, Bicep, ARM Templates, PowerShell, Azure DevOps (YAML pipelines), Octopus Deploy, Team City, GIT, Privileged Identity Management (PIM).</w:t>
       </w:r>
     </w:p>
     <w:p>
@@ -633,7 +633,7 @@
         </w:numPr>
       </w:pPr>
       <w:r>
-        <w:t>Cloud migration from on prem to Azure.</w:t>
+        <w:t>Architected and delivered a greenfield Azure Landing Zone for ColX Group from first principles, using Microsoft's Azure Verified Modules (AVM) pattern across four platform subscriptions and five Terraform stacks, merging over 90 pull requests across three repositories.</w:t>
       </w:r>
     </w:p>
     <w:p>
@@ -644,10 +644,40 @@
         </w:numPr>
       </w:pPr>
       <w:r>
-        <w:t xml:space="preserve">Setting up landing zones using Azure Verified Modules </w:t>
-      </w:r>
-      <w:r>
-        <w:t>.</w:t>
+        <w:t>Built and published a shared library of 14 reusable Terraform modules, including hub networking, DNS Private Resolver, Key Vault, VPN Gateway and Managed DevOps Pools, plus a standalone Azure DevOps pipeline-templates repository, enabling teams to self-serve infrastructure consistently.</w:t>
+      </w:r>
+    </w:p>
+    <w:p>
+      <w:pPr>
+        <w:numPr>
+          <w:ilvl w:val="0"/>
+          <w:numId w:val="36"/>
+        </w:numPr>
+      </w:pPr>
+      <w:r>
+        <w:t>Designed and delivered end-to-end Azure Privileged Identity Management (PIM) governance, covering role tiers, eligibility, approval-gated activation and audit validation, backed by an operational runbook, to establish least-privilege access across the platform.</w:t>
+      </w:r>
+    </w:p>
+    <w:p>
+      <w:pPr>
+        <w:numPr>
+          <w:ilvl w:val="0"/>
+          <w:numId w:val="36"/>
+        </w:numPr>
+      </w:pPr>
+      <w:r>
+        <w:t>Delivered secure hub-and-spoke connectivity with Azure DNS Private Resolver and a site-to-site VPN Gateway to on-premises, and selected Azure Container Apps over AKS as the platform's application hosting model.</w:t>
+      </w:r>
+    </w:p>
+    <w:p>
+      <w:pPr>
+        <w:numPr>
+          <w:ilvl w:val="0"/>
+          <w:numId w:val="36"/>
+        </w:numPr>
+      </w:pPr>
+      <w:r>
+        <w:t>Replaced Microsoft-hosted build agents with a self-hosted Managed DevOps Pool, tuning images and working-hours standby schedules to control compute spend.</w:t>
       </w:r>
     </w:p>
     <w:p>

</xml_diff>

<commit_message>
Update CV to reflect recent DevSecOps roles and achievements at ColX Group and Allica Bank
</commit_message>
<xml_diff>
--- a/Jay Freeman CV.docx
+++ b/Jay Freeman CV.docx
@@ -291,13 +291,15 @@
           <w:bCs/>
         </w:rPr>
       </w:pPr>
-      <w:r>
-        <w:rPr>
-          <w:b/>
-          <w:bCs/>
-        </w:rPr>
-        <w:t>Allica Bank</w:t>
-      </w:r>
+      <w:proofErr w:type="spellStart"/>
+      <w:r>
+        <w:rPr>
+          <w:b/>
+          <w:bCs/>
+        </w:rPr>
+        <w:t>Colx</w:t>
+      </w:r>
+      <w:proofErr w:type="spellEnd"/>
       <w:r>
         <w:rPr>
           <w:b/>
@@ -393,119 +395,7 @@
         </w:numPr>
       </w:pPr>
       <w:r>
-        <w:t xml:space="preserve">Helping out with </w:t>
-      </w:r>
-      <w:proofErr w:type="spellStart"/>
-      <w:r>
-        <w:t>DevSecOps</w:t>
-      </w:r>
-      <w:proofErr w:type="spellEnd"/>
-      <w:r>
-        <w:t xml:space="preserve"> work</w:t>
-      </w:r>
-      <w:r>
-        <w:t>.</w:t>
-      </w:r>
-    </w:p>
-    <w:p>
-      <w:pPr>
-        <w:rPr>
-          <w:b/>
-          <w:bCs/>
-        </w:rPr>
-      </w:pPr>
-      <w:r>
-        <w:rPr>
-          <w:b/>
-          <w:bCs/>
-        </w:rPr>
-        <w:t>Barnett Waddingham</w:t>
-      </w:r>
-      <w:r>
-        <w:rPr>
-          <w:b/>
-          <w:bCs/>
-        </w:rPr>
-        <w:t xml:space="preserve"> | </w:t>
-      </w:r>
-      <w:proofErr w:type="spellStart"/>
-      <w:r>
-        <w:rPr>
-          <w:b/>
-          <w:bCs/>
-        </w:rPr>
-        <w:t>DevSecOps</w:t>
-      </w:r>
-      <w:proofErr w:type="spellEnd"/>
-      <w:r>
-        <w:rPr>
-          <w:b/>
-          <w:bCs/>
-        </w:rPr>
-        <w:t xml:space="preserve"> </w:t>
-      </w:r>
-      <w:r>
-        <w:rPr>
-          <w:b/>
-          <w:bCs/>
-        </w:rPr>
-        <w:t xml:space="preserve">Cloud </w:t>
-      </w:r>
-      <w:r>
-        <w:rPr>
-          <w:b/>
-          <w:bCs/>
-        </w:rPr>
-        <w:t>Consultant</w:t>
-      </w:r>
-      <w:r>
-        <w:rPr>
-          <w:b/>
-          <w:bCs/>
-        </w:rPr>
-        <w:t xml:space="preserve"> (</w:t>
-      </w:r>
-      <w:r>
-        <w:rPr>
-          <w:b/>
-          <w:bCs/>
-        </w:rPr>
-        <w:t xml:space="preserve">May </w:t>
-      </w:r>
-      <w:r>
-        <w:rPr>
-          <w:b/>
-          <w:bCs/>
-        </w:rPr>
-        <w:t>202</w:t>
-      </w:r>
-      <w:r>
-        <w:rPr>
-          <w:b/>
-          <w:bCs/>
-        </w:rPr>
-        <w:t>6</w:t>
-      </w:r>
-      <w:r>
-        <w:rPr>
-          <w:b/>
-          <w:bCs/>
-        </w:rPr>
-        <w:t xml:space="preserve"> – </w:t>
-      </w:r>
-      <w:r>
-        <w:rPr>
-          <w:b/>
-          <w:bCs/>
-        </w:rPr>
-        <w:t>To Present</w:t>
-      </w:r>
-      <w:r>
-        <w:rPr>
-          <w:b/>
-          <w:bCs/>
-        </w:rPr>
-        <w:t>)</w:t>
+        <w:t>Architected and delivered a greenfield Azure Landing Zone for ColX Group from first principles, using Microsoft's Azure Verified Modules (AVM) pattern across 4 platform subscriptions and 5 Terraform stacks (bootstrap, connectivity, management, platform, workload), merging 90+ pull requests across 3 repositories.</w:t>
       </w:r>
     </w:p>
     <w:p>
@@ -516,113 +406,7 @@
         </w:numPr>
       </w:pPr>
       <w:r>
-        <w:t>Cloud migration from on prem to Azure</w:t>
-      </w:r>
-      <w:r>
-        <w:t>.</w:t>
-      </w:r>
-    </w:p>
-    <w:p>
-      <w:pPr>
-        <w:rPr>
-          <w:b/>
-          <w:bCs/>
-        </w:rPr>
-      </w:pPr>
-      <w:proofErr w:type="spellStart"/>
-      <w:r>
-        <w:rPr>
-          <w:b/>
-          <w:bCs/>
-        </w:rPr>
-        <w:t>Colx</w:t>
-      </w:r>
-      <w:proofErr w:type="spellEnd"/>
-      <w:r>
-        <w:rPr>
-          <w:b/>
-          <w:bCs/>
-        </w:rPr>
-        <w:t xml:space="preserve"> | </w:t>
-      </w:r>
-      <w:proofErr w:type="spellStart"/>
-      <w:r>
-        <w:rPr>
-          <w:b/>
-          <w:bCs/>
-        </w:rPr>
-        <w:t>DevSecOps</w:t>
-      </w:r>
-      <w:proofErr w:type="spellEnd"/>
-      <w:r>
-        <w:rPr>
-          <w:b/>
-          <w:bCs/>
-        </w:rPr>
-        <w:t xml:space="preserve"> </w:t>
-      </w:r>
-      <w:r>
-        <w:rPr>
-          <w:b/>
-          <w:bCs/>
-        </w:rPr>
-        <w:t xml:space="preserve">Cloud </w:t>
-      </w:r>
-      <w:r>
-        <w:rPr>
-          <w:b/>
-          <w:bCs/>
-        </w:rPr>
-        <w:t>Consultant</w:t>
-      </w:r>
-      <w:r>
-        <w:rPr>
-          <w:b/>
-          <w:bCs/>
-        </w:rPr>
-        <w:t xml:space="preserve"> (</w:t>
-      </w:r>
-      <w:r>
-        <w:rPr>
-          <w:b/>
-          <w:bCs/>
-        </w:rPr>
-        <w:t xml:space="preserve">May </w:t>
-      </w:r>
-      <w:r>
-        <w:rPr>
-          <w:b/>
-          <w:bCs/>
-        </w:rPr>
-        <w:t>202</w:t>
-      </w:r>
-      <w:r>
-        <w:rPr>
-          <w:b/>
-          <w:bCs/>
-        </w:rPr>
-        <w:t>6</w:t>
-      </w:r>
-      <w:r>
-        <w:rPr>
-          <w:b/>
-          <w:bCs/>
-        </w:rPr>
-        <w:t xml:space="preserve"> – </w:t>
-      </w:r>
-      <w:r>
-        <w:rPr>
-          <w:b/>
-          <w:bCs/>
-        </w:rPr>
-        <w:t>To Present</w:t>
-      </w:r>
-      <w:r>
-        <w:rPr>
-          <w:b/>
-          <w:bCs/>
-        </w:rPr>
-        <w:t>)</w:t>
+        <w:t>Built and published a shared library of 14 reusable Terraform modules (hub networking, DNS Private Resolver, Key Vault, VPN Gateway, Managed DevOps Pools, Dev Center, Container Registry and more), plus a standalone Azure DevOps pipeline-templates repository, enabling teams to self-serve infrastructure consistently.</w:t>
       </w:r>
     </w:p>
     <w:p>
@@ -633,7 +417,7 @@
         </w:numPr>
       </w:pPr>
       <w:r>
-        <w:t>Architected and delivered a greenfield Azure Landing Zone for ColX Group from first principles, using Microsoft's Azure Verified Modules (AVM) pattern across four platform subscriptions and five Terraform stacks, merging over 90 pull requests across three repositories.</w:t>
+        <w:t>Designed and delivered end-to-end Azure Privileged Identity Management (PIM) governance, covering role tiers, eligibility, approval-gated activation and audit validation, backed by an operational runbook, to establish least-privilege access across the platform.</w:t>
       </w:r>
     </w:p>
     <w:p>
@@ -644,7 +428,7 @@
         </w:numPr>
       </w:pPr>
       <w:r>
-        <w:t>Built and published a shared library of 14 reusable Terraform modules, including hub networking, DNS Private Resolver, Key Vault, VPN Gateway and Managed DevOps Pools, plus a standalone Azure DevOps pipeline-templates repository, enabling teams to self-serve infrastructure consistently.</w:t>
+        <w:t>Delivered secure hub-and-spoke connectivity with Azure DNS Private Resolver and a site-to-site VPN Gateway to on-premises, and selected Azure Container Apps over AKS as the platform's application hosting model.</w:t>
       </w:r>
     </w:p>
     <w:p>
@@ -655,7 +439,108 @@
         </w:numPr>
       </w:pPr>
       <w:r>
-        <w:t>Designed and delivered end-to-end Azure Privileged Identity Management (PIM) governance, covering role tiers, eligibility, approval-gated activation and audit validation, backed by an operational runbook, to establish least-privilege access across the platform.</w:t>
+        <w:t>Replaced Microsoft-hosted build agents with a self-hosted Managed DevOps Pool, tuning images and working-hours standby schedules to control compute spend.</w:t>
+      </w:r>
+    </w:p>
+    <w:p>
+      <w:pPr>
+        <w:rPr>
+          <w:b/>
+          <w:bCs/>
+        </w:rPr>
+      </w:pPr>
+      <w:r>
+        <w:rPr>
+          <w:b/>
+          <w:bCs/>
+        </w:rPr>
+        <w:t>Barnett Waddingham</w:t>
+      </w:r>
+      <w:r>
+        <w:rPr>
+          <w:b/>
+          <w:bCs/>
+        </w:rPr>
+        <w:t xml:space="preserve"> | </w:t>
+      </w:r>
+      <w:proofErr w:type="spellStart"/>
+      <w:r>
+        <w:rPr>
+          <w:b/>
+          <w:bCs/>
+        </w:rPr>
+        <w:t>DevSecOps</w:t>
+      </w:r>
+      <w:proofErr w:type="spellEnd"/>
+      <w:r>
+        <w:rPr>
+          <w:b/>
+          <w:bCs/>
+        </w:rPr>
+        <w:t xml:space="preserve"> </w:t>
+      </w:r>
+      <w:r>
+        <w:rPr>
+          <w:b/>
+          <w:bCs/>
+        </w:rPr>
+        <w:t xml:space="preserve">Cloud </w:t>
+      </w:r>
+      <w:r>
+        <w:rPr>
+          <w:b/>
+          <w:bCs/>
+        </w:rPr>
+        <w:t>Consultant</w:t>
+      </w:r>
+      <w:r>
+        <w:rPr>
+          <w:b/>
+          <w:bCs/>
+        </w:rPr>
+        <w:t xml:space="preserve"> (</w:t>
+      </w:r>
+      <w:r>
+        <w:rPr>
+          <w:b/>
+          <w:bCs/>
+        </w:rPr>
+        <w:t xml:space="preserve">May </w:t>
+      </w:r>
+      <w:r>
+        <w:rPr>
+          <w:b/>
+          <w:bCs/>
+        </w:rPr>
+        <w:t>202</w:t>
+      </w:r>
+      <w:r>
+        <w:rPr>
+          <w:b/>
+          <w:bCs/>
+        </w:rPr>
+        <w:t>6</w:t>
+      </w:r>
+      <w:r>
+        <w:rPr>
+          <w:b/>
+          <w:bCs/>
+        </w:rPr>
+        <w:t xml:space="preserve"> – </w:t>
+      </w:r>
+      <w:r>
+        <w:rPr>
+          <w:b/>
+          <w:bCs/>
+        </w:rPr>
+        <w:t>August 2026</w:t>
+      </w:r>
+      <w:r>
+        <w:rPr>
+          <w:b/>
+          <w:bCs/>
+        </w:rPr>
+        <w:t>)</w:t>
       </w:r>
     </w:p>
     <w:p>
@@ -666,7 +551,7 @@
         </w:numPr>
       </w:pPr>
       <w:r>
-        <w:t>Delivered secure hub-and-spoke connectivity with Azure DNS Private Resolver and a site-to-site VPN Gateway to on-premises, and selected Azure Container Apps over AKS as the platform's application hosting model.</w:t>
+        <w:t xml:space="preserve">Delivering a SIPP and investment product to production.</w:t>
       </w:r>
     </w:p>
     <w:p>
@@ -677,7 +562,174 @@
         </w:numPr>
       </w:pPr>
       <w:r>
-        <w:t>Replaced Microsoft-hosted build agents with a self-hosted Managed DevOps Pool, tuning images and working-hours standby schedules to control compute spend.</w:t>
+        <w:t xml:space="preserve">Working on a B2C platform, carrying out general Terraform work to stand up and secure a production environment.</w:t>
+      </w:r>
+    </w:p>
+    <w:p>
+      <w:pPr>
+        <w:numPr>
+          <w:ilvl w:val="0"/>
+          <w:numId w:val="36"/>
+        </w:numPr>
+      </w:pPr>
+      <w:r>
+        <w:t xml:space="preserve">Supporting the development teams with standards, patterns and best practices.</w:t>
+      </w:r>
+    </w:p>
+    <w:p>
+      <w:pPr>
+        <w:rPr>
+          <w:b/>
+          <w:bCs/>
+        </w:rPr>
+      </w:pPr>
+      <w:r>
+        <w:rPr>
+          <w:b/>
+          <w:bCs/>
+        </w:rPr>
+        <w:t>Allica Bank</w:t>
+      </w:r>
+      <w:r>
+        <w:rPr>
+          <w:b/>
+          <w:bCs/>
+        </w:rPr>
+        <w:t xml:space="preserve"> | </w:t>
+      </w:r>
+      <w:proofErr w:type="spellStart"/>
+      <w:r>
+        <w:rPr>
+          <w:b/>
+          <w:bCs/>
+        </w:rPr>
+        <w:t>DevSecOps</w:t>
+      </w:r>
+      <w:proofErr w:type="spellEnd"/>
+      <w:r>
+        <w:rPr>
+          <w:b/>
+          <w:bCs/>
+        </w:rPr>
+        <w:t xml:space="preserve"> </w:t>
+      </w:r>
+      <w:r>
+        <w:rPr>
+          <w:b/>
+          <w:bCs/>
+        </w:rPr>
+        <w:t xml:space="preserve">Cloud </w:t>
+      </w:r>
+      <w:r>
+        <w:rPr>
+          <w:b/>
+          <w:bCs/>
+        </w:rPr>
+        <w:t>Consultant</w:t>
+      </w:r>
+      <w:r>
+        <w:rPr>
+          <w:b/>
+          <w:bCs/>
+        </w:rPr>
+        <w:t xml:space="preserve"> (</w:t>
+      </w:r>
+      <w:r>
+        <w:rPr>
+          <w:b/>
+          <w:bCs/>
+        </w:rPr>
+        <w:t xml:space="preserve">May </w:t>
+      </w:r>
+      <w:r>
+        <w:rPr>
+          <w:b/>
+          <w:bCs/>
+        </w:rPr>
+        <w:t>202</w:t>
+      </w:r>
+      <w:r>
+        <w:rPr>
+          <w:b/>
+          <w:bCs/>
+        </w:rPr>
+        <w:t>6</w:t>
+      </w:r>
+      <w:r>
+        <w:rPr>
+          <w:b/>
+          <w:bCs/>
+        </w:rPr>
+        <w:t xml:space="preserve"> – </w:t>
+      </w:r>
+      <w:r>
+        <w:rPr>
+          <w:b/>
+          <w:bCs/>
+        </w:rPr>
+        <w:t>August 2026</w:t>
+      </w:r>
+      <w:r>
+        <w:rPr>
+          <w:b/>
+          <w:bCs/>
+        </w:rPr>
+        <w:t>)</w:t>
+      </w:r>
+    </w:p>
+    <w:p>
+      <w:pPr>
+        <w:numPr>
+          <w:ilvl w:val="0"/>
+          <w:numId w:val="36"/>
+        </w:numPr>
+      </w:pPr>
+      <w:r>
+        <w:t xml:space="preserve">Updated and hardened Azure Policy definitions and assignments to strengthen governance and security posture.</w:t>
+      </w:r>
+    </w:p>
+    <w:p>
+      <w:pPr>
+        <w:numPr>
+          <w:ilvl w:val="0"/>
+          <w:numId w:val="36"/>
+        </w:numPr>
+      </w:pPr>
+      <w:r>
+        <w:t xml:space="preserve">Implemented the Azure Verified Modules (AVM) Landing Zone pattern for management group creation, establishing a standardised hierarchy.</w:t>
+      </w:r>
+    </w:p>
+    <w:p>
+      <w:pPr>
+        <w:numPr>
+          <w:ilvl w:val="0"/>
+          <w:numId w:val="36"/>
+        </w:numPr>
+      </w:pPr>
+      <w:r>
+        <w:t xml:space="preserve">Authored default policy sets aligning the environment with ISO 27001 and other regulatory standards.</w:t>
+      </w:r>
+    </w:p>
+    <w:p>
+      <w:pPr>
+        <w:numPr>
+          <w:ilvl w:val="0"/>
+          <w:numId w:val="36"/>
+        </w:numPr>
+      </w:pPr>
+      <w:r>
+        <w:t xml:space="preserve">Advised on and helped establish AI best practices and guardrails for the safe adoption of Claude and Microsoft Copilot.</w:t>
+      </w:r>
+    </w:p>
+    <w:p>
+      <w:pPr>
+        <w:numPr>
+          <w:ilvl w:val="0"/>
+          <w:numId w:val="36"/>
+        </w:numPr>
+      </w:pPr>
+      <w:r>
+        <w:t xml:space="preserve">Set up Azure monitoring and reporting to track AI agent usage and cost.</w:t>
       </w:r>
     </w:p>
     <w:p>

</xml_diff>